<commit_message>
Task 3: selection criterion, leakage effect on loss, test the clipping hypothesis
</commit_message>
<xml_diff>
--- a/docs/Task3_Training_Analysis.docx
+++ b/docs/Task3_Training_Analysis.docx
@@ -300,7 +300,7 @@
         <w:rPr>
           <w:i w:val="0"/>
         </w:rPr>
-        <w:t>Loss and error rate are not the same measurement. Loss is computed with teacher forcing: at every position the model is handed the correct previous tokens and only predicts the next one. WER and CER require it to generate the whole transcript unaided, so an early mistake propagates. The two can move independently, and a falling loss does not by itself mean the transcripts are improving.</w:t>
+        <w:t>Loss and error rate are not the same measurement. Loss is computed with teacher forcing: at every position the model is handed the correct previous tokens and only predicts the next one. WER and CER require it to generate the whole transcript unaided, so an early mistake propagates. The two can move independently, and a falling loss does not by itself mean the transcripts are improving. For that reason validation loss is used here to describe the run, never to decide anything: checkpoint selection ran on WER (metric_for_best_model="wer"), which is the metric that reflects what the model actually produces.</w:t>
       </w:r>
     </w:p>
     <w:p>
@@ -2834,6 +2834,14 @@
     <w:p>
       <w:r>
         <w:rPr>
+          <w:i w:val="0"/>
+        </w:rPr>
+        <w:t>A tempting explanation for that one event is the clipped audio left untreated in Task 1, since distorted spectrograms are a plausible source of large gradients. The arithmetic argues against it: 22.10% of the corpus is clipped, so at an effective batch of 16 the chance a batch contains no clipped sample is 1.8%, meaning roughly 615 of the 627 logged steps trained on at least one. If clipping were driving the overflow it would fire constantly rather than once. Settling it properly would mean logging which sample ids were in each batch, which the pipeline does not currently record.</w:t>
+      </w:r>
+    </w:p>
+    <w:p>
+      <w:r>
+        <w:rPr>
           <w:b/>
         </w:rPr>
         <w:t xml:space="preserve">One caveat applies to every number above. </w:t>
@@ -2842,7 +2850,7 @@
         <w:rPr>
           <w:b w:val="0"/>
         </w:rPr>
-        <w:t>Task 1 established that 51.9% of validation transcripts also occur in training, with different audio, so the decoder has already been trained to produce half of these sentences. That affects the level of every figure here, but not the shapes — the epoch steps, the crossover, the flattening — which are what the analysis rests on.</w:t>
+        <w:t>Task 1 established that 51.9% of validation transcripts also occur in training, with different audio, so the decoder has already been trained to produce half of these sentences. Validation loss is hit hardest by this, harder than WER: it is measured with teacher forcing, so on a sentence whose exact token sequence the decoder has already learned, predicting the next token is close to trivial and the loss is depressed for a reason that has nothing to do with the audio. Part of the 47% fall in validation loss is therefore the language model recognising text it has seen, not the acoustic model improving. That affects the level of every figure here, but not the shapes — the epoch steps, the crossover, the flattening — which are what the analysis rests on.</w:t>
       </w:r>
     </w:p>
     <w:sectPr>

</xml_diff>